<commit_message>
Documentation updates (in progress)
</commit_message>
<xml_diff>
--- a/docs/package/out/BrokerVerse_Release_Notes_and_Roadmap.docx
+++ b/docs/package/out/BrokerVerse_Release_Notes_and_Roadmap.docx
@@ -789,7 +789,7 @@
             </w:rPr>
             <w:fldChar w:fldCharType="separate"/>
           </w:r>
-          <w:hyperlink w:anchor="__RefHeading___Toc2951_4180203016">
+          <w:hyperlink w:anchor="__RefHeading___Toc4750_2900764642">
             <w:r>
               <w:rPr>
                 <w:webHidden/>
@@ -824,7 +824,7 @@
             </w:tabs>
             <w:rPr/>
           </w:pPr>
-          <w:hyperlink w:anchor="__RefHeading___Toc2953_4180203016">
+          <w:hyperlink w:anchor="__RefHeading___Toc4752_2900764642">
             <w:r>
               <w:rPr>
                 <w:webHidden/>
@@ -853,7 +853,7 @@
             </w:tabs>
             <w:rPr/>
           </w:pPr>
-          <w:hyperlink w:anchor="__RefHeading___Toc2955_4180203016">
+          <w:hyperlink w:anchor="__RefHeading___Toc4754_2900764642">
             <w:r>
               <w:rPr>
                 <w:webHidden/>
@@ -875,7 +875,7 @@
             </w:tabs>
             <w:rPr/>
           </w:pPr>
-          <w:hyperlink w:anchor="__RefHeading___Toc2957_4180203016">
+          <w:hyperlink w:anchor="__RefHeading___Toc4756_2900764642">
             <w:r>
               <w:rPr>
                 <w:webHidden/>
@@ -897,7 +897,7 @@
             </w:tabs>
             <w:rPr/>
           </w:pPr>
-          <w:hyperlink w:anchor="__RefHeading___Toc2959_4180203016">
+          <w:hyperlink w:anchor="__RefHeading___Toc4758_2900764642">
             <w:r>
               <w:rPr>
                 <w:webHidden/>
@@ -919,7 +919,7 @@
             </w:tabs>
             <w:rPr/>
           </w:pPr>
-          <w:hyperlink w:anchor="__RefHeading___Toc2961_4180203016">
+          <w:hyperlink w:anchor="__RefHeading___Toc4760_2900764642">
             <w:r>
               <w:rPr>
                 <w:webHidden/>
@@ -941,7 +941,7 @@
             </w:tabs>
             <w:rPr/>
           </w:pPr>
-          <w:hyperlink w:anchor="__RefHeading___Toc2963_4180203016">
+          <w:hyperlink w:anchor="__RefHeading___Toc4762_2900764642">
             <w:r>
               <w:rPr>
                 <w:webHidden/>
@@ -963,7 +963,7 @@
             </w:tabs>
             <w:rPr/>
           </w:pPr>
-          <w:hyperlink w:anchor="__RefHeading___Toc2965_4180203016">
+          <w:hyperlink w:anchor="__RefHeading___Toc4764_2900764642">
             <w:r>
               <w:rPr>
                 <w:webHidden/>
@@ -985,7 +985,7 @@
             </w:tabs>
             <w:rPr/>
           </w:pPr>
-          <w:hyperlink w:anchor="__RefHeading___Toc2967_4180203016">
+          <w:hyperlink w:anchor="__RefHeading___Toc4766_2900764642">
             <w:r>
               <w:rPr>
                 <w:webHidden/>
@@ -1007,7 +1007,7 @@
             </w:tabs>
             <w:rPr/>
           </w:pPr>
-          <w:hyperlink w:anchor="__RefHeading___Toc2969_4180203016">
+          <w:hyperlink w:anchor="__RefHeading___Toc4768_2900764642">
             <w:r>
               <w:rPr>
                 <w:webHidden/>
@@ -1029,7 +1029,7 @@
             </w:tabs>
             <w:rPr/>
           </w:pPr>
-          <w:hyperlink w:anchor="__RefHeading___Toc2971_4180203016">
+          <w:hyperlink w:anchor="__RefHeading___Toc4770_2900764642">
             <w:r>
               <w:rPr>
                 <w:webHidden/>
@@ -1051,7 +1051,7 @@
             </w:tabs>
             <w:rPr/>
           </w:pPr>
-          <w:hyperlink w:anchor="__RefHeading___Toc2973_4180203016">
+          <w:hyperlink w:anchor="__RefHeading___Toc4772_2900764642">
             <w:r>
               <w:rPr>
                 <w:webHidden/>
@@ -1073,7 +1073,7 @@
             </w:tabs>
             <w:rPr/>
           </w:pPr>
-          <w:hyperlink w:anchor="__RefHeading___Toc2975_4180203016">
+          <w:hyperlink w:anchor="__RefHeading___Toc4774_2900764642">
             <w:r>
               <w:rPr>
                 <w:webHidden/>
@@ -1095,7 +1095,7 @@
             </w:tabs>
             <w:rPr/>
           </w:pPr>
-          <w:hyperlink w:anchor="__RefHeading___Toc2977_4180203016">
+          <w:hyperlink w:anchor="__RefHeading___Toc4776_2900764642">
             <w:r>
               <w:rPr>
                 <w:webHidden/>
@@ -1117,7 +1117,7 @@
             </w:tabs>
             <w:rPr/>
           </w:pPr>
-          <w:hyperlink w:anchor="__RefHeading___Toc2979_4180203016">
+          <w:hyperlink w:anchor="__RefHeading___Toc4778_2900764642">
             <w:r>
               <w:rPr>
                 <w:webHidden/>
@@ -1139,7 +1139,7 @@
             </w:tabs>
             <w:rPr/>
           </w:pPr>
-          <w:hyperlink w:anchor="__RefHeading___Toc2981_4180203016">
+          <w:hyperlink w:anchor="__RefHeading___Toc4780_2900764642">
             <w:r>
               <w:rPr>
                 <w:webHidden/>
@@ -1161,7 +1161,7 @@
             </w:tabs>
             <w:rPr/>
           </w:pPr>
-          <w:hyperlink w:anchor="__RefHeading___Toc2983_4180203016">
+          <w:hyperlink w:anchor="__RefHeading___Toc4782_2900764642">
             <w:r>
               <w:rPr>
                 <w:webHidden/>
@@ -1183,7 +1183,7 @@
             </w:tabs>
             <w:rPr/>
           </w:pPr>
-          <w:hyperlink w:anchor="__RefHeading___Toc2985_4180203016">
+          <w:hyperlink w:anchor="__RefHeading___Toc4784_2900764642">
             <w:r>
               <w:rPr>
                 <w:webHidden/>
@@ -1205,7 +1205,7 @@
             </w:tabs>
             <w:rPr/>
           </w:pPr>
-          <w:hyperlink w:anchor="__RefHeading___Toc2987_4180203016">
+          <w:hyperlink w:anchor="__RefHeading___Toc4786_2900764642">
             <w:r>
               <w:rPr>
                 <w:webHidden/>
@@ -1227,7 +1227,7 @@
             </w:tabs>
             <w:rPr/>
           </w:pPr>
-          <w:hyperlink w:anchor="__RefHeading___Toc2989_4180203016">
+          <w:hyperlink w:anchor="__RefHeading___Toc4788_2900764642">
             <w:r>
               <w:rPr>
                 <w:webHidden/>
@@ -1249,7 +1249,7 @@
             </w:tabs>
             <w:rPr/>
           </w:pPr>
-          <w:hyperlink w:anchor="__RefHeading___Toc2991_4180203016">
+          <w:hyperlink w:anchor="__RefHeading___Toc4790_2900764642">
             <w:r>
               <w:rPr>
                 <w:webHidden/>
@@ -1271,7 +1271,7 @@
             </w:tabs>
             <w:rPr/>
           </w:pPr>
-          <w:hyperlink w:anchor="__RefHeading___Toc2993_4180203016">
+          <w:hyperlink w:anchor="__RefHeading___Toc4792_2900764642">
             <w:r>
               <w:rPr>
                 <w:webHidden/>
@@ -1293,7 +1293,7 @@
             </w:tabs>
             <w:rPr/>
           </w:pPr>
-          <w:hyperlink w:anchor="__RefHeading___Toc2995_4180203016">
+          <w:hyperlink w:anchor="__RefHeading___Toc4794_2900764642">
             <w:r>
               <w:rPr>
                 <w:webHidden/>
@@ -1315,7 +1315,7 @@
             </w:tabs>
             <w:rPr/>
           </w:pPr>
-          <w:hyperlink w:anchor="__RefHeading___Toc2997_4180203016">
+          <w:hyperlink w:anchor="__RefHeading___Toc4796_2900764642">
             <w:r>
               <w:rPr>
                 <w:webHidden/>
@@ -1363,7 +1363,7 @@
       <w:r>
         <w:br w:type="page"/>
       </w:r>
-      <w:bookmarkStart w:id="0" w:name="__RefHeading___Toc2951_4180203016"/>
+      <w:bookmarkStart w:id="0" w:name="__RefHeading___Toc4750_2900764642"/>
       <w:bookmarkStart w:id="1" w:name="_Toc48319687"/>
       <w:bookmarkStart w:id="2" w:name="_Toc11824118"/>
       <w:bookmarkEnd w:id="0"/>
@@ -2006,7 +2006,7 @@
           <w:spacing w:val="0"/>
         </w:rPr>
       </w:pPr>
-      <w:bookmarkStart w:id="4" w:name="__RefHeading___Toc2953_4180203016"/>
+      <w:bookmarkStart w:id="4" w:name="__RefHeading___Toc4752_2900764642"/>
       <w:bookmarkStart w:id="5" w:name="_Toc233203388"/>
       <w:bookmarkEnd w:id="4"/>
       <w:r>
@@ -4812,7 +4812,7 @@
         <w:pageBreakBefore w:val="false"/>
         <w:rPr/>
       </w:pPr>
-      <w:bookmarkStart w:id="6" w:name="__RefHeading___Toc2955_4180203016"/>
+      <w:bookmarkStart w:id="6" w:name="__RefHeading___Toc4754_2900764642"/>
       <w:bookmarkEnd w:id="6"/>
       <w:r>
         <w:rPr>
@@ -4829,7 +4829,7 @@
         <w:pStyle w:val="Heading2"/>
         <w:rPr/>
       </w:pPr>
-      <w:bookmarkStart w:id="7" w:name="__RefHeading___Toc2957_4180203016"/>
+      <w:bookmarkStart w:id="7" w:name="__RefHeading___Toc4756_2900764642"/>
       <w:bookmarkEnd w:id="7"/>
       <w:r>
         <w:rPr>
@@ -5465,7 +5465,7 @@
         <w:pStyle w:val="Heading2"/>
         <w:rPr/>
       </w:pPr>
-      <w:bookmarkStart w:id="8" w:name="__RefHeading___Toc2959_4180203016"/>
+      <w:bookmarkStart w:id="8" w:name="__RefHeading___Toc4758_2900764642"/>
       <w:bookmarkEnd w:id="8"/>
       <w:r>
         <w:rPr>
@@ -6368,7 +6368,7 @@
         <w:pStyle w:val="Heading1"/>
         <w:rPr/>
       </w:pPr>
-      <w:bookmarkStart w:id="9" w:name="__RefHeading___Toc2961_4180203016"/>
+      <w:bookmarkStart w:id="9" w:name="__RefHeading___Toc4760_2900764642"/>
       <w:bookmarkEnd w:id="9"/>
       <w:r>
         <w:rPr>
@@ -6385,7 +6385,7 @@
         <w:pStyle w:val="Heading2"/>
         <w:rPr/>
       </w:pPr>
-      <w:bookmarkStart w:id="10" w:name="__RefHeading___Toc2963_4180203016"/>
+      <w:bookmarkStart w:id="10" w:name="__RefHeading___Toc4762_2900764642"/>
       <w:bookmarkEnd w:id="10"/>
       <w:r>
         <w:rPr>
@@ -6999,7 +6999,7 @@
         <w:pStyle w:val="Heading2"/>
         <w:rPr/>
       </w:pPr>
-      <w:bookmarkStart w:id="11" w:name="__RefHeading___Toc2965_4180203016"/>
+      <w:bookmarkStart w:id="11" w:name="__RefHeading___Toc4764_2900764642"/>
       <w:bookmarkEnd w:id="11"/>
       <w:r>
         <w:rPr>
@@ -7514,7 +7514,7 @@
         <w:pStyle w:val="Heading2"/>
         <w:rPr/>
       </w:pPr>
-      <w:bookmarkStart w:id="12" w:name="__RefHeading___Toc2967_4180203016"/>
+      <w:bookmarkStart w:id="12" w:name="__RefHeading___Toc4766_2900764642"/>
       <w:bookmarkEnd w:id="12"/>
       <w:r>
         <w:rPr>
@@ -8568,7 +8568,7 @@
         <w:pStyle w:val="Heading2"/>
         <w:rPr/>
       </w:pPr>
-      <w:bookmarkStart w:id="13" w:name="__RefHeading___Toc2969_4180203016"/>
+      <w:bookmarkStart w:id="13" w:name="__RefHeading___Toc4768_2900764642"/>
       <w:bookmarkEnd w:id="13"/>
       <w:r>
         <w:rPr>
@@ -9314,7 +9314,7 @@
         <w:pStyle w:val="Heading2"/>
         <w:rPr/>
       </w:pPr>
-      <w:bookmarkStart w:id="14" w:name="__RefHeading___Toc2971_4180203016"/>
+      <w:bookmarkStart w:id="14" w:name="__RefHeading___Toc4770_2900764642"/>
       <w:bookmarkEnd w:id="14"/>
       <w:r>
         <w:rPr>
@@ -9500,7 +9500,7 @@
                 <w:szCs w:val="24"/>
                 <w:lang w:val="en-US" w:eastAsia="ja-JP" w:bidi="ar-SA"/>
               </w:rPr>
-              <w:t>DST 12.5% of net premium (or per PHP 4.00 unit, rounded up), VAT 12% for products under the VAT regime, LGT by the client's city or municipality (0.75% delivered default), FST 2% on fire lines; set in Master &gt; Finance &gt; Premium Taxes &amp; LGU Rates</w:t>
+              <w:t>DST of PHP 0.50 on each PHP 4.00 of premium, a fraction counting as a whole unit (12.5%), VAT 12% for products under the VAT regime, LGT by the client's city or municipality (0.75% delivered default), FST 2% on fire lines; set in Master &gt; Finance &gt; Premium Taxes &amp; LGU Rates</w:t>
             </w:r>
           </w:p>
         </w:tc>
@@ -10063,7 +10063,7 @@
         <w:pStyle w:val="Heading1"/>
         <w:rPr/>
       </w:pPr>
-      <w:bookmarkStart w:id="15" w:name="__RefHeading___Toc2973_4180203016"/>
+      <w:bookmarkStart w:id="15" w:name="__RefHeading___Toc4772_2900764642"/>
       <w:bookmarkEnd w:id="15"/>
       <w:r>
         <w:rPr>
@@ -10080,7 +10080,7 @@
         <w:pStyle w:val="Heading2"/>
         <w:rPr/>
       </w:pPr>
-      <w:bookmarkStart w:id="16" w:name="__RefHeading___Toc2975_4180203016"/>
+      <w:bookmarkStart w:id="16" w:name="__RefHeading___Toc4774_2900764642"/>
       <w:bookmarkEnd w:id="16"/>
       <w:r>
         <w:rPr>
@@ -11849,7 +11849,7 @@
         <w:pStyle w:val="Heading2"/>
         <w:rPr/>
       </w:pPr>
-      <w:bookmarkStart w:id="17" w:name="__RefHeading___Toc2977_4180203016"/>
+      <w:bookmarkStart w:id="17" w:name="__RefHeading___Toc4776_2900764642"/>
       <w:bookmarkEnd w:id="17"/>
       <w:r>
         <w:rPr>
@@ -13615,7 +13615,7 @@
         <w:pStyle w:val="Heading2"/>
         <w:rPr/>
       </w:pPr>
-      <w:bookmarkStart w:id="18" w:name="__RefHeading___Toc2979_4180203016"/>
+      <w:bookmarkStart w:id="18" w:name="__RefHeading___Toc4778_2900764642"/>
       <w:bookmarkEnd w:id="18"/>
       <w:r>
         <w:rPr>
@@ -13765,7 +13765,7 @@
         <w:pStyle w:val="Heading1"/>
         <w:rPr/>
       </w:pPr>
-      <w:bookmarkStart w:id="19" w:name="__RefHeading___Toc2981_4180203016"/>
+      <w:bookmarkStart w:id="19" w:name="__RefHeading___Toc4780_2900764642"/>
       <w:bookmarkEnd w:id="19"/>
       <w:r>
         <w:rPr>
@@ -13782,7 +13782,7 @@
         <w:pStyle w:val="Heading2"/>
         <w:rPr/>
       </w:pPr>
-      <w:bookmarkStart w:id="20" w:name="__RefHeading___Toc2983_4180203016"/>
+      <w:bookmarkStart w:id="20" w:name="__RefHeading___Toc4782_2900764642"/>
       <w:bookmarkEnd w:id="20"/>
       <w:r>
         <w:rPr>
@@ -14492,7 +14492,7 @@
         <w:pStyle w:val="Heading2"/>
         <w:rPr/>
       </w:pPr>
-      <w:bookmarkStart w:id="21" w:name="__RefHeading___Toc2985_4180203016"/>
+      <w:bookmarkStart w:id="21" w:name="__RefHeading___Toc4784_2900764642"/>
       <w:bookmarkEnd w:id="21"/>
       <w:r>
         <w:rPr>
@@ -14604,7 +14604,7 @@
         <w:pStyle w:val="Heading2"/>
         <w:rPr/>
       </w:pPr>
-      <w:bookmarkStart w:id="22" w:name="__RefHeading___Toc2987_4180203016"/>
+      <w:bookmarkStart w:id="22" w:name="__RefHeading___Toc4786_2900764642"/>
       <w:bookmarkEnd w:id="22"/>
       <w:r>
         <w:rPr>
@@ -14681,7 +14681,7 @@
         <w:pStyle w:val="Heading1"/>
         <w:rPr/>
       </w:pPr>
-      <w:bookmarkStart w:id="23" w:name="__RefHeading___Toc2989_4180203016"/>
+      <w:bookmarkStart w:id="23" w:name="__RefHeading___Toc4788_2900764642"/>
       <w:bookmarkEnd w:id="23"/>
       <w:r>
         <w:rPr>
@@ -14724,7 +14724,7 @@
         <w:pStyle w:val="Heading2"/>
         <w:rPr/>
       </w:pPr>
-      <w:bookmarkStart w:id="24" w:name="__RefHeading___Toc2991_4180203016"/>
+      <w:bookmarkStart w:id="24" w:name="__RefHeading___Toc4790_2900764642"/>
       <w:bookmarkEnd w:id="24"/>
       <w:r>
         <w:rPr>
@@ -15470,7 +15470,7 @@
         <w:pStyle w:val="Heading2"/>
         <w:rPr/>
       </w:pPr>
-      <w:bookmarkStart w:id="25" w:name="__RefHeading___Toc2993_4180203016"/>
+      <w:bookmarkStart w:id="25" w:name="__RefHeading___Toc4792_2900764642"/>
       <w:bookmarkEnd w:id="25"/>
       <w:r>
         <w:rPr>
@@ -16139,7 +16139,7 @@
         <w:pStyle w:val="Heading2"/>
         <w:rPr/>
       </w:pPr>
-      <w:bookmarkStart w:id="26" w:name="__RefHeading___Toc2995_4180203016"/>
+      <w:bookmarkStart w:id="26" w:name="__RefHeading___Toc4794_2900764642"/>
       <w:bookmarkEnd w:id="26"/>
       <w:r>
         <w:rPr>
@@ -16840,7 +16840,7 @@
           <w:spacing w:val="0"/>
         </w:rPr>
       </w:pPr>
-      <w:bookmarkStart w:id="27" w:name="__RefHeading___Toc2997_4180203016"/>
+      <w:bookmarkStart w:id="27" w:name="__RefHeading___Toc4796_2900764642"/>
       <w:bookmarkStart w:id="28" w:name="_Toc233203395"/>
       <w:bookmarkEnd w:id="27"/>
       <w:r>

</xml_diff>